<commit_message>
Rag with History aware.
</commit_message>
<xml_diff>
--- a/RAG System.docx
+++ b/RAG System.docx
@@ -154,18 +154,8 @@
           <w:bCs/>
           <w:lang w:val="en-US"/>
         </w:rPr>
-        <w:t>/</w:t>
-      </w:r>
-      <w:proofErr w:type="spellStart"/>
-      <w:r>
-        <w:rPr>
-          <w:b/>
-          <w:bCs/>
-          <w:lang w:val="en-US"/>
-        </w:rPr>
-        <w:t>VectorDB</w:t>
-      </w:r>
-      <w:proofErr w:type="spellEnd"/>
+        <w:t>/VectorDB</w:t>
+      </w:r>
       <w:r>
         <w:rPr>
           <w:lang w:val="en-US"/>
@@ -261,21 +251,7 @@
         <w:rPr>
           <w:lang w:val="en-US"/>
         </w:rPr>
-        <w:t xml:space="preserve">Advantage of higher dimensional embedding model </w:t>
-      </w:r>
-      <w:proofErr w:type="gramStart"/>
-      <w:r>
-        <w:rPr>
-          <w:lang w:val="en-US"/>
-        </w:rPr>
-        <w:t>is</w:t>
-      </w:r>
-      <w:proofErr w:type="gramEnd"/>
-      <w:r>
-        <w:rPr>
-          <w:lang w:val="en-US"/>
-        </w:rPr>
-        <w:t xml:space="preserve"> it </w:t>
+        <w:t xml:space="preserve">Advantage of higher dimensional embedding model is it </w:t>
       </w:r>
       <w:r>
         <w:rPr>
@@ -287,21 +263,7 @@
         <w:rPr>
           <w:lang w:val="en-US"/>
         </w:rPr>
-        <w:t xml:space="preserve"> more semantic information about the text passage. Downside more expense to embed </w:t>
-      </w:r>
-      <w:proofErr w:type="gramStart"/>
-      <w:r>
-        <w:rPr>
-          <w:lang w:val="en-US"/>
-        </w:rPr>
-        <w:t>as well we</w:t>
-      </w:r>
-      <w:proofErr w:type="gramEnd"/>
-      <w:r>
-        <w:rPr>
-          <w:lang w:val="en-US"/>
-        </w:rPr>
-        <w:t xml:space="preserve"> store. </w:t>
+        <w:t xml:space="preserve"> more semantic information about the text passage. Downside more expense to embed as well we store. </w:t>
       </w:r>
     </w:p>
     <w:p>
@@ -635,16 +597,8 @@
         <w:rPr>
           <w:lang w:val="en-US"/>
         </w:rPr>
-        <w:t xml:space="preserve"> </w:t>
-      </w:r>
-      <w:proofErr w:type="spellStart"/>
-      <w:r>
-        <w:rPr>
-          <w:lang w:val="en-US"/>
-        </w:rPr>
-        <w:t>db</w:t>
-      </w:r>
-      <w:proofErr w:type="spellEnd"/>
+        <w:t xml:space="preserve"> db</w:t>
+      </w:r>
       <w:r>
         <w:rPr>
           <w:lang w:val="en-US"/>
@@ -1137,6 +1091,137 @@
           </wp:inline>
         </w:drawing>
       </w:r>
+    </w:p>
+    <w:p>
+      <w:pPr>
+        <w:rPr>
+          <w:lang w:val="en-US"/>
+        </w:rPr>
+      </w:pPr>
+    </w:p>
+    <w:p>
+      <w:pPr>
+        <w:pStyle w:val="Heading2"/>
+        <w:rPr>
+          <w:lang w:val="en-US"/>
+        </w:rPr>
+      </w:pPr>
+      <w:r>
+        <w:rPr>
+          <w:lang w:val="en-US"/>
+        </w:rPr>
+        <w:t>History-aware RAG</w:t>
+      </w:r>
+    </w:p>
+    <w:p>
+      <w:pPr>
+        <w:rPr>
+          <w:lang w:val="en-US"/>
+        </w:rPr>
+      </w:pPr>
+      <w:r>
+        <w:rPr>
+          <w:lang w:val="en-US"/>
+        </w:rPr>
+        <w:t xml:space="preserve">In history-aware RAG, there’s one crucial extra step: query reformulation. </w:t>
+      </w:r>
+    </w:p>
+    <w:p>
+      <w:pPr>
+        <w:rPr>
+          <w:lang w:val="en-US"/>
+        </w:rPr>
+      </w:pPr>
+      <w:r>
+        <w:rPr>
+          <w:lang w:val="en-US"/>
+        </w:rPr>
+        <w:t xml:space="preserve">Before searching, the system looks at the conversation history and </w:t>
+      </w:r>
+      <w:r>
+        <w:rPr>
+          <w:lang w:val="en-US"/>
+        </w:rPr>
+        <w:t>rewrites vague</w:t>
+      </w:r>
+      <w:r>
+        <w:rPr>
+          <w:lang w:val="en-US"/>
+        </w:rPr>
+        <w:t xml:space="preserve"> or context </w:t>
+      </w:r>
+      <w:r>
+        <w:rPr>
+          <w:lang w:val="en-US"/>
+        </w:rPr>
+        <w:t>dependent</w:t>
+      </w:r>
+      <w:r>
+        <w:rPr>
+          <w:lang w:val="en-US"/>
+        </w:rPr>
+        <w:t xml:space="preserve"> questions into clear and standalone questions.</w:t>
+      </w:r>
+      <w:r>
+        <w:rPr>
+          <w:lang w:val="en-US"/>
+        </w:rPr>
+        <w:br/>
+      </w:r>
+    </w:p>
+    <w:p>
+      <w:pPr>
+        <w:rPr>
+          <w:lang w:val="en-US"/>
+        </w:rPr>
+      </w:pPr>
+      <w:r>
+        <w:rPr>
+          <w:lang w:val="en-US"/>
+        </w:rPr>
+        <w:drawing>
+          <wp:inline distT="0" distB="0" distL="0" distR="0" wp14:anchorId="17F6763B" wp14:editId="03A72D3D">
+            <wp:extent cx="6449185" cy="3309582"/>
+            <wp:effectExtent l="0" t="0" r="0" b="5715"/>
+            <wp:docPr id="91892052" name="Picture 1" descr="A screenshot of a computer&#10;&#10;AI-generated content may be incorrect."/>
+            <wp:cNvGraphicFramePr>
+              <a:graphicFrameLocks xmlns:a="http://schemas.openxmlformats.org/drawingml/2006/main" noChangeAspect="1"/>
+            </wp:cNvGraphicFramePr>
+            <a:graphic xmlns:a="http://schemas.openxmlformats.org/drawingml/2006/main">
+              <a:graphicData uri="http://schemas.openxmlformats.org/drawingml/2006/picture">
+                <pic:pic xmlns:pic="http://schemas.openxmlformats.org/drawingml/2006/picture">
+                  <pic:nvPicPr>
+                    <pic:cNvPr id="91892052" name="Picture 1" descr="A screenshot of a computer&#10;&#10;AI-generated content may be incorrect."/>
+                    <pic:cNvPicPr/>
+                  </pic:nvPicPr>
+                  <pic:blipFill>
+                    <a:blip r:embed="rId15"/>
+                    <a:stretch>
+                      <a:fillRect/>
+                    </a:stretch>
+                  </pic:blipFill>
+                  <pic:spPr>
+                    <a:xfrm>
+                      <a:off x="0" y="0"/>
+                      <a:ext cx="6485432" cy="3328183"/>
+                    </a:xfrm>
+                    <a:prstGeom prst="rect">
+                      <a:avLst/>
+                    </a:prstGeom>
+                  </pic:spPr>
+                </pic:pic>
+              </a:graphicData>
+            </a:graphic>
+          </wp:inline>
+        </w:drawing>
+      </w:r>
+    </w:p>
+    <w:p>
+      <w:pPr>
+        <w:rPr>
+          <w:lang w:val="en-US"/>
+        </w:rPr>
+      </w:pPr>
     </w:p>
     <w:p>
       <w:pPr>
@@ -2737,15 +2822,8 @@
 <file path=customXml/itemProps1.xml><?xml version="1.0" encoding="utf-8"?>
 <ds:datastoreItem xmlns:ds="http://schemas.openxmlformats.org/officeDocument/2006/customXml" ds:itemID="{C80D2BE9-8598-48C4-AAE5-7E23D34B102A}">
   <ds:schemaRefs>
-    <ds:schemaRef ds:uri="http://purl.org/dc/elements/1.1/"/>
-    <ds:schemaRef ds:uri="b819c194-d396-464d-ad6e-db8a9a5d4c6e"/>
-    <ds:schemaRef ds:uri="http://purl.org/dc/dcmitype/"/>
-    <ds:schemaRef ds:uri="http://www.w3.org/XML/1998/namespace"/>
+    <ds:schemaRef ds:uri="http://schemas.microsoft.com/office/2006/metadata/properties"/>
     <ds:schemaRef ds:uri="http://schemas.microsoft.com/office/infopath/2007/PartnerControls"/>
-    <ds:schemaRef ds:uri="http://purl.org/dc/terms/"/>
-    <ds:schemaRef ds:uri="http://schemas.microsoft.com/office/2006/documentManagement/types"/>
-    <ds:schemaRef ds:uri="http://schemas.openxmlformats.org/package/2006/metadata/core-properties"/>
-    <ds:schemaRef ds:uri="http://schemas.microsoft.com/office/2006/metadata/properties"/>
   </ds:schemaRefs>
 </ds:datastoreItem>
 </file>

</xml_diff>